<commit_message>
UoSH notes update + Pitch outline add
</commit_message>
<xml_diff>
--- a/Peryton Electric Propulsion Pitch Document.docx
+++ b/Peryton Electric Propulsion Pitch Document.docx
@@ -31,6 +31,134 @@
           <w:szCs w:val="52"/>
         </w:rPr>
         <w:t xml:space="preserve"> Document</w:t>
+      </w:r>
+    </w:p>
+    <w:p>
+      <w:pPr>
+        <w:pStyle w:val="Heading1"/>
+      </w:pPr>
+      <w:r>
+        <w:t xml:space="preserve">Over struct of Presentation </w:t>
+      </w:r>
+    </w:p>
+    <w:p>
+      <w:pPr>
+        <w:pStyle w:val="ListParagraph"/>
+        <w:numPr>
+          <w:ilvl w:val="0"/>
+          <w:numId w:val="3"/>
+        </w:numPr>
+      </w:pPr>
+      <w:r>
+        <w:t xml:space="preserve">Project Objectives </w:t>
+      </w:r>
+    </w:p>
+    <w:p>
+      <w:pPr>
+        <w:pStyle w:val="ListParagraph"/>
+        <w:numPr>
+          <w:ilvl w:val="0"/>
+          <w:numId w:val="3"/>
+        </w:numPr>
+      </w:pPr>
+      <w:r>
+        <w:t>Plan outline</w:t>
+      </w:r>
+    </w:p>
+    <w:p>
+      <w:pPr>
+        <w:pStyle w:val="ListParagraph"/>
+        <w:numPr>
+          <w:ilvl w:val="1"/>
+          <w:numId w:val="3"/>
+        </w:numPr>
+      </w:pPr>
+      <w:r>
+        <w:t xml:space="preserve">Plan to first engine </w:t>
+      </w:r>
+    </w:p>
+    <w:p>
+      <w:pPr>
+        <w:pStyle w:val="ListParagraph"/>
+        <w:numPr>
+          <w:ilvl w:val="1"/>
+          <w:numId w:val="3"/>
+        </w:numPr>
+      </w:pPr>
+      <w:r>
+        <w:t xml:space="preserve">Component sourcing </w:t>
+      </w:r>
+    </w:p>
+    <w:p>
+      <w:pPr>
+        <w:pStyle w:val="ListParagraph"/>
+        <w:numPr>
+          <w:ilvl w:val="1"/>
+          <w:numId w:val="3"/>
+        </w:numPr>
+      </w:pPr>
+      <w:r>
+        <w:t xml:space="preserve">General Engine Design </w:t>
+      </w:r>
+    </w:p>
+    <w:p>
+      <w:pPr>
+        <w:pStyle w:val="ListParagraph"/>
+        <w:numPr>
+          <w:ilvl w:val="0"/>
+          <w:numId w:val="3"/>
+        </w:numPr>
+      </w:pPr>
+      <w:r>
+        <w:t xml:space="preserve">Budget + funding sources </w:t>
+      </w:r>
+    </w:p>
+    <w:p>
+      <w:pPr>
+        <w:pStyle w:val="ListParagraph"/>
+        <w:numPr>
+          <w:ilvl w:val="0"/>
+          <w:numId w:val="3"/>
+        </w:numPr>
+      </w:pPr>
+      <w:r>
+        <w:t>Interest in project from within Peryton</w:t>
+      </w:r>
+    </w:p>
+    <w:p>
+      <w:pPr>
+        <w:pStyle w:val="ListParagraph"/>
+        <w:numPr>
+          <w:ilvl w:val="0"/>
+          <w:numId w:val="3"/>
+        </w:numPr>
+      </w:pPr>
+      <w:r>
+        <w:t>Possible L4C applications???</w:t>
+      </w:r>
+    </w:p>
+    <w:p>
+      <w:pPr>
+        <w:pStyle w:val="ListParagraph"/>
+        <w:numPr>
+          <w:ilvl w:val="0"/>
+          <w:numId w:val="3"/>
+        </w:numPr>
+      </w:pPr>
+      <w:r>
+        <w:t xml:space="preserve">Academics involved + resources they will bring </w:t>
+      </w:r>
+    </w:p>
+    <w:p>
+      <w:pPr>
+        <w:pStyle w:val="ListParagraph"/>
+        <w:numPr>
+          <w:ilvl w:val="0"/>
+          <w:numId w:val="3"/>
+        </w:numPr>
+      </w:pPr>
+      <w:r>
+        <w:t xml:space="preserve">Conclusions and questions </w:t>
       </w:r>
     </w:p>
     <w:p>
@@ -185,6 +313,7 @@
     </w:p>
     <w:p>
       <w:r>
+        <w:lastRenderedPageBreak/>
         <w:t xml:space="preserve">Potential </w:t>
       </w:r>
       <w:r>
@@ -747,6 +876,7 @@
         </w:numPr>
       </w:pPr>
       <w:r>
+        <w:lastRenderedPageBreak/>
         <w:t xml:space="preserve">RE: Cathodes, </w:t>
       </w:r>
       <w:r>
@@ -758,885 +888,7 @@
       <w:r>
         <w:t>researchers have created their own modular hollow cathode, could significantly reduce overall costs by collaborating with them and using their cathode</w:t>
       </w:r>
-      <w:r>
-        <w:t>.</w:t>
-      </w:r>
-    </w:p>
-    <w:p>
-      <w:pPr>
-        <w:pStyle w:val="ListParagraph"/>
-      </w:pPr>
-      <w:r>
-        <w:br w:type="page"/>
-      </w:r>
-    </w:p>
-    <w:p>
-      <w:r>
-        <w:t>Call Notes</w:t>
-      </w:r>
-    </w:p>
-    <w:p>
-      <w:r>
-        <w:t>£</w:t>
-      </w:r>
-      <w:r>
-        <w:t>100</w:t>
-      </w:r>
-      <w:r>
-        <w:t>0 from t</w:t>
-      </w:r>
-      <w:r>
-        <w:t>he uni</w:t>
-      </w:r>
-      <w:r>
-        <w:t>versity</w:t>
-      </w:r>
-    </w:p>
-    <w:p>
-      <w:r>
-        <w:t xml:space="preserve">Sponsors </w:t>
-      </w:r>
-    </w:p>
-    <w:p>
-      <w:r>
-        <w:t>R</w:t>
-      </w:r>
-      <w:r>
-        <w:t>e</w:t>
-      </w:r>
-      <w:r>
-        <w:t>search the</w:t>
-      </w:r>
-      <w:r>
-        <w:t xml:space="preserve">ory, why </w:t>
-      </w:r>
-      <w:r>
-        <w:t>certain</w:t>
-      </w:r>
-      <w:r>
-        <w:t xml:space="preserve"> parameter</w:t>
-      </w:r>
-      <w:r>
-        <w:t>s are th</w:t>
-      </w:r>
-      <w:r>
-        <w:t xml:space="preserve">e way they </w:t>
-      </w:r>
-      <w:r>
-        <w:t xml:space="preserve">are, </w:t>
-      </w:r>
-    </w:p>
-    <w:p>
-      <w:r>
-        <w:t>M</w:t>
-      </w:r>
-      <w:r>
-        <w:t>a</w:t>
-      </w:r>
-      <w:r>
-        <w:t xml:space="preserve">ke sure </w:t>
-      </w:r>
-      <w:r>
-        <w:t>understa</w:t>
-      </w:r>
-      <w:r>
-        <w:t xml:space="preserve">nd plasma </w:t>
-      </w:r>
-      <w:r>
-        <w:t xml:space="preserve">basics, </w:t>
-      </w:r>
-      <w:r>
-        <w:t>don’t need to know</w:t>
-      </w:r>
-      <w:r>
-        <w:t xml:space="preserve"> a lot to get star</w:t>
-      </w:r>
-      <w:r>
-        <w:t>ted</w:t>
-      </w:r>
-    </w:p>
-    <w:p>
-      <w:r>
-        <w:t xml:space="preserve">2 </w:t>
-      </w:r>
-      <w:r>
-        <w:t>subteam</w:t>
-      </w:r>
-      <w:r>
-        <w:t>s</w:t>
-      </w:r>
-    </w:p>
-    <w:p>
-      <w:r>
-        <w:t>Magnetic te</w:t>
-      </w:r>
-      <w:r>
-        <w:t>ams</w:t>
-      </w:r>
-      <w:r>
-        <w:t xml:space="preserve"> op</w:t>
-      </w:r>
-      <w:r>
-        <w:t xml:space="preserve">timise field </w:t>
-      </w:r>
-      <w:r>
-        <w:t>topology</w:t>
-      </w:r>
-      <w:r>
-        <w:t xml:space="preserve">, actual </w:t>
-      </w:r>
-      <w:r>
-        <w:t>design</w:t>
-      </w:r>
-      <w:r>
-        <w:t xml:space="preserve"> of magneti</w:t>
-      </w:r>
-      <w:r>
-        <w:t>c ci</w:t>
-      </w:r>
-      <w:r>
-        <w:t>rcuit</w:t>
-      </w:r>
-    </w:p>
-    <w:p>
-      <w:r>
-        <w:t>A</w:t>
-      </w:r>
-      <w:r>
-        <w:t>nod</w:t>
-      </w:r>
-      <w:r>
-        <w:t>e team</w:t>
-      </w:r>
-    </w:p>
-    <w:p>
-      <w:r>
-        <w:t>N</w:t>
-      </w:r>
-      <w:r>
-        <w:t>e</w:t>
-      </w:r>
-      <w:r>
-        <w:t xml:space="preserve">ed really </w:t>
-      </w:r>
-      <w:r>
-        <w:t>good</w:t>
-      </w:r>
-      <w:r>
-        <w:t xml:space="preserve"> magne</w:t>
-      </w:r>
-      <w:r>
-        <w:t>tic circ</w:t>
-      </w:r>
-      <w:r>
-        <w:t>uit</w:t>
-      </w:r>
-    </w:p>
-    <w:p>
-      <w:r>
-        <w:t>Main magnet</w:t>
-      </w:r>
-      <w:r>
-        <w:t>ic circuit,</w:t>
-      </w:r>
-      <w:r>
-        <w:t xml:space="preserve"> soft</w:t>
-      </w:r>
-      <w:r>
-        <w:t xml:space="preserve"> iron</w:t>
-      </w:r>
-    </w:p>
-    <w:p>
-      <w:r>
-        <w:t xml:space="preserve">Ceramic </w:t>
-      </w:r>
-      <w:r>
-        <w:t xml:space="preserve">– boron </w:t>
-      </w:r>
-      <w:r>
-        <w:t>nitri</w:t>
-      </w:r>
-      <w:r>
-        <w:t xml:space="preserve">de, </w:t>
-      </w:r>
-      <w:r>
-        <w:t>Southampton got t</w:t>
-      </w:r>
-      <w:r>
-        <w:t>heirs made</w:t>
-      </w:r>
-      <w:r>
-        <w:t xml:space="preserve"> in china</w:t>
-      </w:r>
-      <w:r>
-        <w:t xml:space="preserve">, </w:t>
-      </w:r>
-      <w:r>
-        <w:t>£</w:t>
-      </w:r>
-      <w:r>
-        <w:t>3</w:t>
-      </w:r>
-      <w:r>
-        <w:t>00-40</w:t>
-      </w:r>
-      <w:r>
-        <w:t xml:space="preserve">0 </w:t>
-      </w:r>
-    </w:p>
-    <w:p>
-      <w:r>
-        <w:t>S</w:t>
-      </w:r>
-      <w:r>
-        <w:t>t</w:t>
-      </w:r>
-      <w:r>
-        <w:t>an</w:t>
-      </w:r>
-      <w:r>
-        <w:t>dard manu</w:t>
-      </w:r>
-      <w:r>
-        <w:t>factur</w:t>
-      </w:r>
-      <w:r>
-        <w:t>ers:</w:t>
-      </w:r>
-      <w:r>
-        <w:br/>
-      </w:r>
-      <w:r>
-        <w:t>innovascera</w:t>
-      </w:r>
-      <w:r>
-        <w:t xml:space="preserve"> </w:t>
-      </w:r>
-      <w:r>
-        <w:t>–</w:t>
-      </w:r>
-      <w:r>
-        <w:t xml:space="preserve"> </w:t>
-      </w:r>
-      <w:r>
-        <w:t>custom ce</w:t>
-      </w:r>
-      <w:r>
-        <w:t>ramics</w:t>
-      </w:r>
-    </w:p>
-    <w:p>
-      <w:r>
-        <w:t>M</w:t>
-      </w:r>
-      <w:r>
-        <w:t>et</w:t>
-      </w:r>
-      <w:r>
-        <w:t>allic man</w:t>
-      </w:r>
-      <w:r>
-        <w:t>ufactu</w:t>
-      </w:r>
-      <w:r>
-        <w:t>rer</w:t>
-      </w:r>
-    </w:p>
-    <w:p>
-      <w:r>
-        <w:t>T</w:t>
-      </w:r>
-      <w:r>
-        <w:t>heir</w:t>
-      </w:r>
-      <w:r>
-        <w:t xml:space="preserve"> </w:t>
-      </w:r>
-      <w:r>
-        <w:t>ho</w:t>
-      </w:r>
-      <w:r>
-        <w:t xml:space="preserve">llow </w:t>
-      </w:r>
-      <w:r>
-        <w:t xml:space="preserve">cathode </w:t>
-      </w:r>
-      <w:r>
-        <w:t xml:space="preserve">was </w:t>
-      </w:r>
-      <w:r>
-        <w:t>provid</w:t>
-      </w:r>
-      <w:r>
-        <w:t>ed by pr</w:t>
-      </w:r>
-      <w:r>
-        <w:t>ofessor</w:t>
-      </w:r>
-      <w:r>
-        <w:t>, they use</w:t>
-      </w:r>
-      <w:r>
-        <w:t>d argon</w:t>
-      </w:r>
-      <w:r>
-        <w:t>, co</w:t>
-      </w:r>
-      <w:r>
-        <w:t xml:space="preserve">uld make </w:t>
-      </w:r>
-      <w:r>
-        <w:t>filament cath</w:t>
-      </w:r>
-      <w:r>
-        <w:t>ode</w:t>
-      </w:r>
-    </w:p>
-    <w:p>
-      <w:r>
-        <w:t>Doing lec</w:t>
-      </w:r>
-      <w:r>
-        <w:t>tures to ne</w:t>
-      </w:r>
-      <w:r>
-        <w:t xml:space="preserve">w members on </w:t>
-      </w:r>
-      <w:r>
-        <w:t>propulsion</w:t>
-      </w:r>
-      <w:r>
-        <w:t xml:space="preserve"> basic</w:t>
-      </w:r>
-      <w:r>
-        <w:t>s</w:t>
-      </w:r>
-    </w:p>
-    <w:p/>
-    <w:p>
-      <w:r>
-        <w:t>Researc</w:t>
-      </w:r>
-      <w:r>
-        <w:t>h low p</w:t>
-      </w:r>
-      <w:r>
-        <w:t>ower scali</w:t>
-      </w:r>
-      <w:r>
-        <w:t>ng</w:t>
-      </w:r>
-    </w:p>
-    <w:p>
-      <w:r>
-        <w:t>M</w:t>
-      </w:r>
-      <w:r>
-        <w:t>ade</w:t>
-      </w:r>
-      <w:r>
-        <w:t xml:space="preserve"> </w:t>
-      </w:r>
-      <w:r>
-        <w:t>their own</w:t>
-      </w:r>
-      <w:r>
-        <w:t xml:space="preserve"> database,</w:t>
-      </w:r>
-      <w:r>
-        <w:t xml:space="preserve"> reverse </w:t>
-      </w:r>
-      <w:r>
-        <w:t>enginee</w:t>
-      </w:r>
-      <w:r>
-        <w:t>red scali</w:t>
-      </w:r>
-      <w:r>
-        <w:t>ng laws</w:t>
-      </w:r>
-      <w:r>
-        <w:t>, bu</w:t>
-      </w:r>
-      <w:r>
-        <w:t>t went wit</w:t>
-      </w:r>
-      <w:r>
-        <w:t xml:space="preserve">h lee’s </w:t>
-      </w:r>
-    </w:p>
-    <w:p>
-      <w:r>
-        <w:t>S</w:t>
-      </w:r>
-      <w:r>
-        <w:t>tar</w:t>
-      </w:r>
-      <w:r>
-        <w:t>t with g</w:t>
-      </w:r>
-      <w:r>
-        <w:t>eometry</w:t>
-      </w:r>
-      <w:r>
-        <w:t xml:space="preserve">, </w:t>
-      </w:r>
-      <w:r>
-        <w:t>simulate m</w:t>
-      </w:r>
-      <w:r>
-        <w:t>agnetic fiel</w:t>
-      </w:r>
-      <w:r>
-        <w:t xml:space="preserve">ds </w:t>
-      </w:r>
-      <w:r>
-        <w:t>– most impo</w:t>
-      </w:r>
-      <w:r>
-        <w:t xml:space="preserve">rtant part </w:t>
-      </w:r>
-      <w:r>
-        <w:t>–</w:t>
-      </w:r>
-      <w:r>
-        <w:t xml:space="preserve"> </w:t>
-      </w:r>
-      <w:r>
-        <w:t xml:space="preserve">want to </w:t>
-      </w:r>
-      <w:r>
-        <w:t>do CFD on</w:t>
-      </w:r>
-      <w:r>
-        <w:t xml:space="preserve"> anode for </w:t>
-      </w:r>
-      <w:r>
-        <w:t>even ga</w:t>
-      </w:r>
-      <w:r>
-        <w:t>s distr</w:t>
-      </w:r>
-      <w:r>
-        <w:t>ibu</w:t>
-      </w:r>
-      <w:r>
-        <w:t>tion</w:t>
-      </w:r>
-      <w:r>
-        <w:t xml:space="preserve">. </w:t>
-      </w:r>
-    </w:p>
-    <w:p>
-      <w:r>
-        <w:t>O</w:t>
-      </w:r>
-      <w:r>
-        <w:t>pen</w:t>
-      </w:r>
-      <w:r>
-        <w:t xml:space="preserve"> source magne</w:t>
-      </w:r>
-      <w:r>
-        <w:t>tic softw</w:t>
-      </w:r>
-      <w:r>
-        <w:t xml:space="preserve">are, </w:t>
-      </w:r>
-      <w:r>
-        <w:t>FEMM</w:t>
-      </w:r>
-      <w:r>
-        <w:t xml:space="preserve"> fin</w:t>
-      </w:r>
-      <w:r>
-        <w:t>ite elem</w:t>
-      </w:r>
-      <w:r>
-        <w:t xml:space="preserve">ent method </w:t>
-      </w:r>
-      <w:r>
-        <w:t>magnetics</w:t>
-      </w:r>
-      <w:r>
-        <w:t xml:space="preserve"> </w:t>
-      </w:r>
-      <w:hyperlink r:id="rId13" w:history="1">
-        <w:r>
-          <w:rPr>
-            <w:rStyle w:val="Hyperlink"/>
-          </w:rPr>
-          <w:t>HomePage:Finite Element Method Magnetics</w:t>
-        </w:r>
-      </w:hyperlink>
-    </w:p>
-    <w:p>
-      <w:hyperlink r:id="rId14" w:history="1">
-        <w:r>
-          <w:rPr>
-            <w:rStyle w:val="Hyperlink"/>
-          </w:rPr>
-          <w:t>agros - Open way for computing</w:t>
-        </w:r>
-      </w:hyperlink>
-      <w:r>
-        <w:t xml:space="preserve"> </w:t>
-      </w:r>
-    </w:p>
-    <w:p>
-      <w:hyperlink r:id="rId15" w:history="1">
-        <w:r>
-          <w:rPr>
-            <w:rStyle w:val="Hyperlink"/>
-          </w:rPr>
-          <w:t>COMSOL - Software for Multiphysics Simulation</w:t>
-        </w:r>
-      </w:hyperlink>
-      <w:r>
-        <w:t xml:space="preserve"> – paid but might </w:t>
-      </w:r>
-      <w:r>
-        <w:t>have acces</w:t>
-      </w:r>
-      <w:r>
-        <w:t>s thru un</w:t>
-      </w:r>
-      <w:r>
-        <w:t xml:space="preserve">i, can </w:t>
-      </w:r>
-      <w:r>
-        <w:t>do</w:t>
-      </w:r>
-      <w:r>
-        <w:t xml:space="preserve"> more </w:t>
-      </w:r>
-      <w:r>
-        <w:t>precise sim</w:t>
-      </w:r>
-      <w:r>
-        <w:t xml:space="preserve">ulations </w:t>
-      </w:r>
-      <w:r>
-        <w:t xml:space="preserve">&amp; </w:t>
-      </w:r>
-      <w:r>
-        <w:t>3</w:t>
-      </w:r>
-      <w:r>
-        <w:t>D simu</w:t>
-      </w:r>
-      <w:r>
-        <w:t>lations</w:t>
-      </w:r>
-      <w:r>
-        <w:t xml:space="preserve"> but FEMM</w:t>
-      </w:r>
-      <w:r>
-        <w:t xml:space="preserve"> is </w:t>
-      </w:r>
-      <w:r>
-        <w:t>fine for starting o</w:t>
-      </w:r>
-      <w:r>
-        <w:t>ut</w:t>
-      </w:r>
-    </w:p>
-    <w:p>
-      <w:r>
-        <w:t>S</w:t>
-      </w:r>
-      <w:r>
-        <w:t>oftw</w:t>
-      </w:r>
-      <w:r>
-        <w:t>are is mo</w:t>
-      </w:r>
-      <w:r>
-        <w:t>st importa</w:t>
-      </w:r>
-      <w:r>
-        <w:t xml:space="preserve">nt to make </w:t>
-      </w:r>
-    </w:p>
-    <w:p>
-      <w:r>
-        <w:t xml:space="preserve">Wrap </w:t>
-      </w:r>
-      <w:r>
-        <w:t>around co</w:t>
-      </w:r>
-      <w:r>
-        <w:t xml:space="preserve">il </w:t>
-      </w:r>
-      <w:r>
-        <w:t>desi</w:t>
-      </w:r>
-      <w:r>
-        <w:t>gn, o</w:t>
-      </w:r>
-      <w:r>
-        <w:t>ne coil wrap</w:t>
-      </w:r>
-      <w:r>
-        <w:t>s around ce</w:t>
-      </w:r>
-      <w:r>
-        <w:t xml:space="preserve">ntre and another large </w:t>
-      </w:r>
-      <w:r>
-        <w:t>coil</w:t>
-      </w:r>
-      <w:r>
-        <w:t xml:space="preserve">. Their og </w:t>
-      </w:r>
-      <w:r>
-        <w:t>design h</w:t>
-      </w:r>
-      <w:r>
-        <w:t>ad 4 separ</w:t>
-      </w:r>
-      <w:r>
-        <w:t xml:space="preserve">ate </w:t>
-      </w:r>
-      <w:r>
-        <w:t>electromagnet</w:t>
-      </w:r>
-      <w:r>
-        <w:t>ics,</w:t>
-      </w:r>
-      <w:r>
-        <w:t xml:space="preserve"> when you </w:t>
-      </w:r>
-      <w:r>
-        <w:t xml:space="preserve">simulate </w:t>
-      </w:r>
-      <w:r>
-        <w:t>wrap</w:t>
-      </w:r>
-      <w:r>
-        <w:t xml:space="preserve"> around coil </w:t>
-      </w:r>
-      <w:r>
-        <w:t xml:space="preserve">its </w:t>
-      </w:r>
-      <w:r>
-        <w:t xml:space="preserve">symmetric, </w:t>
-      </w:r>
-      <w:r>
-        <w:t xml:space="preserve">2d </w:t>
-      </w:r>
-      <w:r>
-        <w:t>simulation will b</w:t>
-      </w:r>
-      <w:r>
-        <w:t>e almost</w:t>
-      </w:r>
-      <w:r>
-        <w:t xml:space="preserve"> exact as</w:t>
-      </w:r>
-      <w:r>
-        <w:t xml:space="preserve"> 3d</w:t>
-      </w:r>
-      <w:r>
-        <w:t xml:space="preserve">, they did </w:t>
-      </w:r>
-      <w:r>
-        <w:t>2d op</w:t>
-      </w:r>
-      <w:r>
-        <w:t>timisat</w:t>
-      </w:r>
-      <w:r>
-        <w:t>ion then w</w:t>
-      </w:r>
-      <w:r>
-        <w:t>hen they w</w:t>
-      </w:r>
-      <w:r>
-        <w:t>ent to 3d h</w:t>
-      </w:r>
-      <w:r>
-        <w:t>ad to redo optimis</w:t>
-      </w:r>
-      <w:r>
-        <w:t>ation</w:t>
-      </w:r>
-    </w:p>
-    <w:p/>
-    <w:p>
-      <w:r>
-        <w:t>RE</w:t>
-      </w:r>
-      <w:r>
-        <w:t>: Anode, basi</w:t>
-      </w:r>
-      <w:r>
-        <w:t>c design</w:t>
-      </w:r>
-      <w:r>
-        <w:t xml:space="preserve">, </w:t>
-      </w:r>
-      <w:r>
-        <w:t>layer of 4 hol</w:t>
-      </w:r>
-      <w:r>
-        <w:t xml:space="preserve">es then </w:t>
-      </w:r>
-      <w:r>
-        <w:t>8 then 1</w:t>
-      </w:r>
-      <w:r>
-        <w:t>6</w:t>
-      </w:r>
-      <w:r>
-        <w:t xml:space="preserve"> </w:t>
-      </w:r>
-      <w:r>
-        <w:t>for g</w:t>
-      </w:r>
-      <w:r>
-        <w:t>as distr</w:t>
-      </w:r>
-      <w:r>
-        <w:t>ibution</w:t>
-      </w:r>
-      <w:r>
-        <w:t>, ca</w:t>
-      </w:r>
-      <w:r>
-        <w:t>n change things</w:t>
-      </w:r>
-      <w:r>
-        <w:t xml:space="preserve"> </w:t>
-      </w:r>
-      <w:r>
-        <w:t>and us</w:t>
-      </w:r>
-      <w:r>
-        <w:t>e CF</w:t>
-      </w:r>
-      <w:r>
-        <w:t>D to make s</w:t>
-      </w:r>
-      <w:r>
-        <w:t>ure works as e</w:t>
-      </w:r>
-      <w:r>
-        <w:t>xpected</w:t>
-      </w:r>
-    </w:p>
-    <w:p/>
-    <w:p>
-      <w:r>
-        <w:t>Issues they ran int</w:t>
-      </w:r>
-      <w:r>
-        <w:t xml:space="preserve">o </w:t>
-      </w:r>
-    </w:p>
-    <w:p>
-      <w:r>
-        <w:t>O</w:t>
-      </w:r>
-      <w:r>
-        <w:t>ne</w:t>
-      </w:r>
-      <w:r>
-        <w:t xml:space="preserve"> major </w:t>
-      </w:r>
-      <w:r>
-        <w:t>hur</w:t>
-      </w:r>
-      <w:r>
-        <w:t>dle was</w:t>
-      </w:r>
-      <w:r>
-        <w:t xml:space="preserve"> learnin</w:t>
-      </w:r>
-      <w:r>
-        <w:t xml:space="preserve">g the </w:t>
-      </w:r>
-      <w:r>
-        <w:t>softwar</w:t>
-      </w:r>
-      <w:r>
-        <w:t>e</w:t>
-      </w:r>
-    </w:p>
-    <w:p>
-      <w:r>
-        <w:t>O</w:t>
-      </w:r>
-      <w:r>
-        <w:t>ne</w:t>
-      </w:r>
-      <w:r>
-        <w:t xml:space="preserve"> good thing is </w:t>
-      </w:r>
-      <w:r>
-        <w:t>look</w:t>
-      </w:r>
-      <w:r>
-        <w:t xml:space="preserve"> at </w:t>
-      </w:r>
-      <w:r>
-        <w:t>what we</w:t>
-      </w:r>
-      <w:r>
-        <w:t>ve got</w:t>
-      </w:r>
-      <w:r>
-        <w:t xml:space="preserve"> plan</w:t>
-      </w:r>
-      <w:r>
-        <w:t>ned and</w:t>
-      </w:r>
-      <w:r>
-        <w:t xml:space="preserve"> evi</w:t>
-      </w:r>
-      <w:r>
-        <w:t xml:space="preserve">dence we can </w:t>
-      </w:r>
-      <w:r>
-        <w:t xml:space="preserve">do it, </w:t>
-      </w:r>
-      <w:r>
-        <w:t>we nee</w:t>
-      </w:r>
-      <w:r>
-        <w:t>d money.</w:t>
-      </w:r>
-      <w:r>
-        <w:t xml:space="preserve"> </w:t>
-      </w:r>
-    </w:p>
-    <w:p>
-      <w:r>
-        <w:t>C</w:t>
-      </w:r>
-      <w:r>
-        <w:t>ou</w:t>
-      </w:r>
-      <w:r>
-        <w:t>ld do as</w:t>
-      </w:r>
-      <w:r>
-        <w:t xml:space="preserve"> low as </w:t>
-      </w:r>
-      <w:r>
-        <w:t>£600</w:t>
-      </w:r>
-      <w:r>
-        <w:t>-700</w:t>
-      </w:r>
-      <w:r>
-        <w:t xml:space="preserve">, aim for </w:t>
-      </w:r>
-      <w:r>
-        <w:t>£1500</w:t>
-      </w:r>
-    </w:p>
-    <w:p/>
+    </w:p>
     <w:sectPr>
       <w:pgSz w:w="11906" w:h="16838"/>
       <w:pgMar w:top="1440" w:right="1440" w:bottom="1440" w:left="1440" w:header="708" w:footer="708" w:gutter="0"/>
@@ -1875,11 +1127,126 @@
       </w:rPr>
     </w:lvl>
   </w:abstractNum>
+  <w:abstractNum w:abstractNumId="2" w15:restartNumberingAfterBreak="0">
+    <w:nsid w:val="7EFD73DE"/>
+    <w:multiLevelType w:val="hybridMultilevel"/>
+    <w:tmpl w:val="2E8C3902"/>
+    <w:lvl w:ilvl="0" w:tplc="4D762386">
+      <w:numFmt w:val="bullet"/>
+      <w:lvlText w:val="-"/>
+      <w:lvlJc w:val="left"/>
+      <w:pPr>
+        <w:ind w:left="720" w:hanging="360"/>
+      </w:pPr>
+      <w:rPr>
+        <w:rFonts w:ascii="Aptos" w:eastAsiaTheme="minorHAnsi" w:hAnsi="Aptos" w:cstheme="minorBidi" w:hint="default"/>
+      </w:rPr>
+    </w:lvl>
+    <w:lvl w:ilvl="1" w:tplc="08090003">
+      <w:start w:val="1"/>
+      <w:numFmt w:val="bullet"/>
+      <w:lvlText w:val="o"/>
+      <w:lvlJc w:val="left"/>
+      <w:pPr>
+        <w:ind w:left="1440" w:hanging="360"/>
+      </w:pPr>
+      <w:rPr>
+        <w:rFonts w:ascii="Courier New" w:hAnsi="Courier New" w:cs="Courier New" w:hint="default"/>
+      </w:rPr>
+    </w:lvl>
+    <w:lvl w:ilvl="2" w:tplc="08090005" w:tentative="1">
+      <w:start w:val="1"/>
+      <w:numFmt w:val="bullet"/>
+      <w:lvlText w:val=""/>
+      <w:lvlJc w:val="left"/>
+      <w:pPr>
+        <w:ind w:left="2160" w:hanging="360"/>
+      </w:pPr>
+      <w:rPr>
+        <w:rFonts w:ascii="Wingdings" w:hAnsi="Wingdings" w:hint="default"/>
+      </w:rPr>
+    </w:lvl>
+    <w:lvl w:ilvl="3" w:tplc="08090001" w:tentative="1">
+      <w:start w:val="1"/>
+      <w:numFmt w:val="bullet"/>
+      <w:lvlText w:val=""/>
+      <w:lvlJc w:val="left"/>
+      <w:pPr>
+        <w:ind w:left="2880" w:hanging="360"/>
+      </w:pPr>
+      <w:rPr>
+        <w:rFonts w:ascii="Symbol" w:hAnsi="Symbol" w:hint="default"/>
+      </w:rPr>
+    </w:lvl>
+    <w:lvl w:ilvl="4" w:tplc="08090003" w:tentative="1">
+      <w:start w:val="1"/>
+      <w:numFmt w:val="bullet"/>
+      <w:lvlText w:val="o"/>
+      <w:lvlJc w:val="left"/>
+      <w:pPr>
+        <w:ind w:left="3600" w:hanging="360"/>
+      </w:pPr>
+      <w:rPr>
+        <w:rFonts w:ascii="Courier New" w:hAnsi="Courier New" w:cs="Courier New" w:hint="default"/>
+      </w:rPr>
+    </w:lvl>
+    <w:lvl w:ilvl="5" w:tplc="08090005" w:tentative="1">
+      <w:start w:val="1"/>
+      <w:numFmt w:val="bullet"/>
+      <w:lvlText w:val=""/>
+      <w:lvlJc w:val="left"/>
+      <w:pPr>
+        <w:ind w:left="4320" w:hanging="360"/>
+      </w:pPr>
+      <w:rPr>
+        <w:rFonts w:ascii="Wingdings" w:hAnsi="Wingdings" w:hint="default"/>
+      </w:rPr>
+    </w:lvl>
+    <w:lvl w:ilvl="6" w:tplc="08090001" w:tentative="1">
+      <w:start w:val="1"/>
+      <w:numFmt w:val="bullet"/>
+      <w:lvlText w:val=""/>
+      <w:lvlJc w:val="left"/>
+      <w:pPr>
+        <w:ind w:left="5040" w:hanging="360"/>
+      </w:pPr>
+      <w:rPr>
+        <w:rFonts w:ascii="Symbol" w:hAnsi="Symbol" w:hint="default"/>
+      </w:rPr>
+    </w:lvl>
+    <w:lvl w:ilvl="7" w:tplc="08090003" w:tentative="1">
+      <w:start w:val="1"/>
+      <w:numFmt w:val="bullet"/>
+      <w:lvlText w:val="o"/>
+      <w:lvlJc w:val="left"/>
+      <w:pPr>
+        <w:ind w:left="5760" w:hanging="360"/>
+      </w:pPr>
+      <w:rPr>
+        <w:rFonts w:ascii="Courier New" w:hAnsi="Courier New" w:cs="Courier New" w:hint="default"/>
+      </w:rPr>
+    </w:lvl>
+    <w:lvl w:ilvl="8" w:tplc="08090005" w:tentative="1">
+      <w:start w:val="1"/>
+      <w:numFmt w:val="bullet"/>
+      <w:lvlText w:val=""/>
+      <w:lvlJc w:val="left"/>
+      <w:pPr>
+        <w:ind w:left="6480" w:hanging="360"/>
+      </w:pPr>
+      <w:rPr>
+        <w:rFonts w:ascii="Wingdings" w:hAnsi="Wingdings" w:hint="default"/>
+      </w:rPr>
+    </w:lvl>
+  </w:abstractNum>
   <w:num w:numId="1" w16cid:durableId="1693528720">
     <w:abstractNumId w:val="1"/>
   </w:num>
   <w:num w:numId="2" w16cid:durableId="871110192">
     <w:abstractNumId w:val="0"/>
+  </w:num>
+  <w:num w:numId="3" w16cid:durableId="1418018704">
+    <w:abstractNumId w:val="2"/>
   </w:num>
 </w:numbering>
 </file>
@@ -2483,6 +1850,7 @@
   <w:style w:type="character" w:default="1" w:styleId="DefaultParagraphFont">
     <w:name w:val="Default Paragraph Font"/>
     <w:uiPriority w:val="1"/>
+    <w:semiHidden/>
     <w:unhideWhenUsed/>
   </w:style>
   <w:style w:type="table" w:default="1" w:styleId="TableNormal">
@@ -2813,6 +2181,18 @@
     <w:rPr>
       <w:color w:val="605E5C"/>
       <w:shd w:val="clear" w:color="auto" w:fill="E1DFDD"/>
+    </w:rPr>
+  </w:style>
+  <w:style w:type="character" w:styleId="FollowedHyperlink">
+    <w:name w:val="FollowedHyperlink"/>
+    <w:basedOn w:val="DefaultParagraphFont"/>
+    <w:uiPriority w:val="99"/>
+    <w:semiHidden/>
+    <w:unhideWhenUsed/>
+    <w:rsid w:val="008E427A"/>
+    <w:rPr>
+      <w:color w:val="96607D" w:themeColor="followedHyperlink"/>
+      <w:u w:val="single"/>
     </w:rPr>
   </w:style>
 </w:styles>

</xml_diff>